<commit_message>
Correct membership admission guide
</commit_message>
<xml_diff>
--- a/user-guides/Chisimba_Membership_and_Payment_Operations_Guide.docx
+++ b/user-guides/Chisimba_Membership_and_Payment_Operations_Guide.docx
@@ -3088,7 +3088,7 @@
         <w:widowControl/>
       </w:pPr>
       <w:r>
-        <w:t>Admit one person at a time from the course/group interface until bulk import is delivered.</w:t>
+        <w:t>Admit one person at a time, or use the CSV preview/import workflow for a reviewed batch of existing users.</w:t>
       </w:r>
     </w:p>
     <w:p>
@@ -3113,10 +3113,10 @@
         <w:rPr>
           <w:b/>
         </w:rPr>
-        <w:t xml:space="preserve">Planned capability  </w:t>
+        <w:t xml:space="preserve">Account safety  </w:t>
       </w:r>
       <w:r>
-        <w:t>CSV admission upload and a dedicated exceptional payment-review view remain future operational improvements.</w:t>
+        <w:t>CSV admission import resolves existing canonical users only; it does not create accounts. A dedicated exceptional payment-review view remains a future operational improvement.</w:t>
       </w:r>
     </w:p>
     <w:p>

</xml_diff>